<commit_message>
Improve markdown export rendering
</commit_message>
<xml_diff>
--- a/md-to-word-quick-action/reference.docx
+++ b/md-to-word-quick-action/reference.docx
@@ -251,7 +251,7 @@
       <w:footnotePr>
         <w:numRestart w:val="eachSect"/>
       </w:footnotePr>
-      <w:pgMar w:top="1320" w:right="1260" w:bottom="1320" w:left="1260" w:header="720" w:footer="720" w:gutter="0"/>
+      <w:pgMar w:top="1701" w:right="1440" w:bottom="1701" w:left="1800" w:header="851" w:footer="851" w:gutter="0"/>
     </w:sectPr>
   </w:body>
 </w:document>
@@ -475,7 +475,7 @@
   <w:docDefaults>
     <w:rPrDefault>
       <w:rPr>
-        <w:rFonts w:asciiTheme="minorHAnsi" w:cstheme="minorBidi" w:eastAsiaTheme="minorEastAsia" w:hAnsiTheme="minorHAnsi" w:ascii="Calibri" w:hAnsi="Calibri" w:eastAsia="宋体" w:cs="Calibri" w:hint="eastAsia"/>
+        <w:rFonts w:asciiTheme="minorHAnsi" w:cstheme="minorBidi" w:eastAsiaTheme="minorEastAsia" w:hAnsiTheme="minorHAnsi" w:ascii="Garamond" w:hAnsi="Garamond" w:eastAsia="宋体" w:cs="Garamond" w:hint="eastAsia"/>
         <w:sz w:val="24"/>
         <w:szCs w:val="24"/>
         <w:lang w:bidi="ar-SA" w:eastAsia="zh-CN" w:val="en-US"/>
@@ -483,8 +483,7 @@
     </w:rPrDefault>
     <w:pPrDefault>
       <w:pPr>
-        <w:spacing w:after="140" w:before="0" w:line="336" w:lineRule="auto"/>
-        <w:ind w:firstLine="420"/>
+        <w:spacing w:after="180" w:before="0" w:line="360" w:lineRule="auto"/>
       </w:pPr>
     </w:pPrDefault>
   </w:docDefaults>
@@ -493,14 +492,14 @@
     <w:name w:val="Normal"/>
     <w:qFormat/>
     <w:pPr>
-      <w:spacing w:after="140" w:line="336" w:lineRule="auto"/>
-      <w:ind w:firstLine="420"/>
-    </w:pPr>
-    <w:rPr>
-      <w:rFonts w:ascii="Georgia" w:hAnsi="Georgia" w:eastAsia="宋体" w:cs="Georgia" w:hint="eastAsia"/>
+      <w:spacing w:after="180" w:line="360" w:lineRule="auto"/>
+      <w:ind w:firstLine="0"/>
+    </w:pPr>
+    <w:rPr>
+      <w:rFonts w:ascii="Garamond" w:hAnsi="Garamond" w:eastAsia="宋体" w:cs="Garamond" w:hint="eastAsia"/>
       <w:sz w:val="24"/>
       <w:szCs w:val="24"/>
-      <w:color w:val="222222"/>
+      <w:color w:val="1E293B"/>
     </w:rPr>
   </w:style>
   <w:style w:styleId="BodyText" w:type="paragraph">
@@ -528,9 +527,9 @@
     </w:pPr>
     <w:rPr>
       <w:rFonts w:ascii="Calibri" w:hAnsi="Calibri" w:eastAsia="宋体" w:cs="Calibri" w:hint="eastAsia"/>
-      <w:sz w:val="21"/>
-      <w:szCs w:val="21"/>
-      <w:color w:val="222222"/>
+      <w:sz w:val="22"/>
+      <w:szCs w:val="22"/>
+      <w:color w:val="1E293B"/>
     </w:rPr>
   </w:style>
   <w:style w:styleId="Title" w:type="paragraph">
@@ -542,15 +541,15 @@
     <w:qFormat/>
     <w:rsid w:val="00A10FD9"/>
     <w:pPr>
-      <w:spacing w:after="220" w:line="300" w:lineRule="auto" w:before="0"/>
+      <w:spacing w:after="260" w:line="300" w:lineRule="auto" w:before="0"/>
       <w:contextualSpacing/>
       <w:jc w:val="center"/>
     </w:pPr>
     <w:rPr>
-      <w:rFonts w:asciiTheme="majorHAnsi" w:cstheme="majorBidi" w:eastAsiaTheme="majorEastAsia" w:hAnsiTheme="majorHAnsi" w:ascii="Calibri" w:hAnsi="Calibri" w:eastAsia="微软雅黑" w:cs="Calibri" w:hint="eastAsia"/>
-      <w:sz w:val="40"/>
-      <w:szCs w:val="40"/>
-      <w:color w:val="1F3A5F"/>
+      <w:rFonts w:asciiTheme="majorHAnsi" w:cstheme="majorBidi" w:eastAsiaTheme="majorEastAsia" w:hAnsiTheme="majorHAnsi" w:ascii="Times New Roman" w:hAnsi="Times New Roman" w:eastAsia="黑体" w:cs="Times New Roman" w:hint="eastAsia"/>
+      <w:sz w:val="48"/>
+      <w:szCs w:val="48"/>
+      <w:color w:val="111827"/>
       <w:b/>
     </w:rPr>
   </w:style>
@@ -562,8 +561,8 @@
     <w:rsid w:val="00A10FD9"/>
     <w:rPr>
       <w:rFonts w:asciiTheme="majorHAnsi" w:cstheme="majorBidi" w:eastAsiaTheme="majorEastAsia" w:hAnsiTheme="majorHAnsi" w:ascii="Calibri" w:hAnsi="Calibri" w:eastAsia="微软雅黑" w:cs="Calibri" w:hint="eastAsia"/>
-      <w:sz w:val="40"/>
-      <w:szCs w:val="40"/>
+      <w:sz w:val="44"/>
+      <w:szCs w:val="44"/>
     </w:rPr>
   </w:style>
   <w:style w:styleId="Subtitle" w:type="paragraph">
@@ -578,14 +577,15 @@
       <w:numPr>
         <w:ilvl w:val="1"/>
       </w:numPr>
-      <w:spacing w:before="0" w:after="180" w:line="280" w:lineRule="auto"/>
-    </w:pPr>
-    <w:rPr>
-      <w:rFonts w:cstheme="majorBidi" w:eastAsiaTheme="majorEastAsia" w:ascii="Calibri" w:hAnsi="Calibri" w:eastAsia="等线" w:cs="Calibri" w:hint="eastAsia"/>
+      <w:jc w:val="center"/>
+      <w:spacing w:before="0" w:after="200" w:line="280" w:lineRule="auto"/>
+    </w:pPr>
+    <w:rPr>
+      <w:rFonts w:cstheme="majorBidi" w:eastAsiaTheme="majorEastAsia" w:ascii="Calibri" w:hAnsi="Calibri" w:eastAsia="黑体" w:cs="Calibri" w:hint="eastAsia"/>
       <w:spacing w:val="15"/>
-      <w:sz w:val="24"/>
-      <w:szCs w:val="24"/>
-      <w:color w:val="5C6B7A"/>
+      <w:sz w:val="26"/>
+      <w:szCs w:val="26"/>
+      <w:color w:val="4B5563"/>
     </w:rPr>
   </w:style>
   <w:style w:customStyle="1" w:styleId="SubtitleChar" w:type="character">
@@ -595,7 +595,7 @@
     <w:uiPriority w:val="11"/>
     <w:rsid w:val="00A10FD9"/>
     <w:rPr>
-      <w:rFonts w:cstheme="majorBidi" w:eastAsiaTheme="majorEastAsia" w:ascii="Calibri" w:hAnsi="Calibri" w:eastAsia="等线" w:cs="Calibri" w:hint="eastAsia"/>
+      <w:rFonts w:cstheme="majorBidi" w:eastAsiaTheme="majorEastAsia" w:ascii="Calibri" w:hAnsi="Calibri" w:eastAsia="微软雅黑" w:cs="Calibri" w:hint="eastAsia"/>
       <w:color w:themeColor="text1" w:themeTint="A6" w:val="595959"/>
       <w:spacing w:val="15"/>
       <w:sz w:val="24"/>
@@ -681,22 +681,47 @@
     <w:pPr>
       <w:keepNext/>
       <w:keepLines/>
-      <w:spacing w:after="140" w:before="260" w:line="300" w:lineRule="auto"/>
+      <w:spacing w:after="280" w:before="560" w:line="300" w:lineRule="auto"/>
       <w:outlineLvl w:val="0"/>
-    </w:pPr>
-    <w:rPr>
-      <w:rFonts w:asciiTheme="majorHAnsi" w:cstheme="majorBidi" w:eastAsiaTheme="majorEastAsia" w:hAnsiTheme="majorHAnsi" w:ascii="Calibri" w:hAnsi="Calibri" w:eastAsia="微软雅黑" w:cs="Calibri" w:hint="eastAsia"/>
-      <w:color w:themeColor="accent1" w:themeShade="BF" w:val="1F4E79"/>
+      <w:jc w:val="center"/>
+    </w:pPr>
+    <w:rPr>
+      <w:rFonts w:asciiTheme="majorHAnsi" w:cstheme="majorBidi" w:eastAsiaTheme="majorEastAsia" w:hAnsiTheme="majorHAnsi" w:ascii="Calibri" w:hAnsi="Calibri" w:eastAsia="黑体" w:cs="Calibri" w:hint="eastAsia"/>
+      <w:color w:themeColor="accent1" w:themeShade="BF" w:val="111827"/>
+      <w:sz w:val="40"/>
+      <w:szCs w:val="40"/>
+      <w:b/>
+    </w:rPr>
+  </w:style>
+  <w:style w:styleId="Heading2" w:type="paragraph">
+    <w:name w:val="heading 2"/>
+    <w:basedOn w:val="Normal"/>
+    <w:next w:val="BodyText"/>
+    <w:link w:val="Heading2Char"/>
+    <w:uiPriority w:val="9"/>
+    <w:semiHidden/>
+    <w:unhideWhenUsed/>
+    <w:qFormat/>
+    <w:rsid w:val="00A10FD9"/>
+    <w:pPr>
+      <w:keepNext/>
+      <w:keepLines/>
+      <w:spacing w:after="160" w:before="420" w:line="300" w:lineRule="auto"/>
+      <w:outlineLvl w:val="1"/>
+    </w:pPr>
+    <w:rPr>
+      <w:rFonts w:asciiTheme="majorHAnsi" w:cstheme="majorBidi" w:eastAsiaTheme="majorEastAsia" w:hAnsiTheme="majorHAnsi" w:ascii="Calibri" w:hAnsi="Calibri" w:eastAsia="黑体" w:cs="Calibri" w:hint="eastAsia"/>
+      <w:color w:themeColor="accent1" w:themeShade="BF" w:val="111827"/>
       <w:sz w:val="32"/>
       <w:szCs w:val="32"/>
       <w:b/>
     </w:rPr>
   </w:style>
-  <w:style w:styleId="Heading2" w:type="paragraph">
-    <w:name w:val="heading 2"/>
+  <w:style w:styleId="Heading3" w:type="paragraph">
+    <w:name w:val="heading 3"/>
     <w:basedOn w:val="Normal"/>
     <w:next w:val="BodyText"/>
-    <w:link w:val="Heading2Char"/>
+    <w:link w:val="Heading3Char"/>
     <w:uiPriority w:val="9"/>
     <w:semiHidden/>
     <w:unhideWhenUsed/>
@@ -705,38 +730,14 @@
     <w:pPr>
       <w:keepNext/>
       <w:keepLines/>
-      <w:spacing w:after="100" w:before="220" w:line="288" w:lineRule="auto"/>
-      <w:outlineLvl w:val="1"/>
-    </w:pPr>
-    <w:rPr>
-      <w:rFonts w:asciiTheme="majorHAnsi" w:cstheme="majorBidi" w:eastAsiaTheme="majorEastAsia" w:hAnsiTheme="majorHAnsi" w:ascii="Calibri" w:hAnsi="Calibri" w:eastAsia="等线" w:cs="Calibri" w:hint="eastAsia"/>
-      <w:color w:themeColor="accent1" w:themeShade="BF" w:val="285A6E"/>
-      <w:sz w:val="27"/>
-      <w:szCs w:val="27"/>
-      <w:b/>
-    </w:rPr>
-  </w:style>
-  <w:style w:styleId="Heading3" w:type="paragraph">
-    <w:name w:val="heading 3"/>
-    <w:basedOn w:val="Normal"/>
-    <w:next w:val="BodyText"/>
-    <w:link w:val="Heading3Char"/>
-    <w:uiPriority w:val="9"/>
-    <w:semiHidden/>
-    <w:unhideWhenUsed/>
-    <w:qFormat/>
-    <w:rsid w:val="00A10FD9"/>
-    <w:pPr>
-      <w:keepNext/>
-      <w:keepLines/>
-      <w:spacing w:after="60" w:before="180" w:line="288" w:lineRule="auto"/>
+      <w:spacing w:after="100" w:before="300" w:line="288" w:lineRule="auto"/>
       <w:outlineLvl w:val="2"/>
     </w:pPr>
     <w:rPr>
-      <w:rFonts w:cstheme="majorBidi" w:eastAsiaTheme="majorEastAsia" w:ascii="Calibri" w:hAnsi="Calibri" w:eastAsia="等线" w:cs="Calibri" w:hint="eastAsia"/>
-      <w:color w:themeColor="accent1" w:themeShade="BF" w:val="4B5D73"/>
-      <w:sz w:val="24"/>
-      <w:szCs w:val="24"/>
+      <w:rFonts w:cstheme="majorBidi" w:eastAsiaTheme="majorEastAsia" w:ascii="Calibri" w:hAnsi="Calibri" w:eastAsia="黑体" w:cs="Calibri" w:hint="eastAsia"/>
+      <w:color w:themeColor="accent1" w:themeShade="BF" w:val="374151"/>
+      <w:sz w:val="28"/>
+      <w:szCs w:val="28"/>
       <w:b/>
     </w:rPr>
   </w:style>
@@ -879,10 +880,10 @@
     <w:uiPriority w:val="9"/>
     <w:rsid w:val="00A10FD9"/>
     <w:rPr>
-      <w:rFonts w:asciiTheme="majorHAnsi" w:cstheme="majorBidi" w:eastAsiaTheme="majorEastAsia" w:hAnsiTheme="majorHAnsi" w:ascii="Calibri" w:hAnsi="Calibri" w:eastAsia="等线" w:cs="Calibri" w:hint="eastAsia"/>
+      <w:rFonts w:asciiTheme="majorHAnsi" w:cstheme="majorBidi" w:eastAsiaTheme="majorEastAsia" w:hAnsiTheme="majorHAnsi" w:ascii="Calibri" w:hAnsi="Calibri" w:eastAsia="微软雅黑" w:cs="Calibri" w:hint="eastAsia"/>
       <w:color w:themeColor="accent1" w:themeShade="BF" w:val="0F4761"/>
-      <w:sz w:val="40"/>
-      <w:szCs w:val="40"/>
+      <w:sz w:val="38"/>
+      <w:szCs w:val="38"/>
     </w:rPr>
   </w:style>
   <w:style w:customStyle="1" w:styleId="Heading2Char" w:type="character">
@@ -893,10 +894,10 @@
     <w:semiHidden/>
     <w:rsid w:val="00A10FD9"/>
     <w:rPr>
-      <w:rFonts w:asciiTheme="majorHAnsi" w:cstheme="majorBidi" w:eastAsiaTheme="majorEastAsia" w:hAnsiTheme="majorHAnsi" w:ascii="Calibri" w:hAnsi="Calibri" w:eastAsia="等线" w:cs="Calibri" w:hint="eastAsia"/>
+      <w:rFonts w:asciiTheme="majorHAnsi" w:cstheme="majorBidi" w:eastAsiaTheme="majorEastAsia" w:hAnsiTheme="majorHAnsi" w:ascii="Calibri" w:hAnsi="Calibri" w:eastAsia="微软雅黑" w:cs="Calibri" w:hint="eastAsia"/>
       <w:color w:themeColor="accent1" w:themeShade="BF" w:val="0F4761"/>
-      <w:sz w:val="32"/>
-      <w:szCs w:val="32"/>
+      <w:sz w:val="30"/>
+      <w:szCs w:val="30"/>
     </w:rPr>
   </w:style>
   <w:style w:customStyle="1" w:styleId="Heading3Char" w:type="character">
@@ -907,10 +908,10 @@
     <w:semiHidden/>
     <w:rsid w:val="00A10FD9"/>
     <w:rPr>
-      <w:rFonts w:cstheme="majorBidi" w:eastAsiaTheme="majorEastAsia" w:ascii="Calibri" w:hAnsi="Calibri" w:eastAsia="等线" w:cs="Calibri" w:hint="eastAsia"/>
+      <w:rFonts w:cstheme="majorBidi" w:eastAsiaTheme="majorEastAsia" w:ascii="Calibri" w:hAnsi="Calibri" w:eastAsia="微软雅黑" w:cs="Calibri" w:hint="eastAsia"/>
       <w:color w:themeColor="accent1" w:themeShade="BF" w:val="0F4761"/>
-      <w:sz w:val="28"/>
-      <w:szCs w:val="28"/>
+      <w:sz w:val="26"/>
+      <w:szCs w:val="26"/>
     </w:rPr>
   </w:style>
   <w:style w:customStyle="1" w:styleId="Heading4Char" w:type="character">
@@ -999,15 +1000,14 @@
     <w:unhideWhenUsed/>
     <w:qFormat/>
     <w:pPr>
-      <w:spacing w:after="140" w:before="60" w:line="320" w:lineRule="auto"/>
-      <w:ind w:firstLine="0" w:left="520" w:right="480"/>
-    </w:pPr>
-    <w:rPr>
-      <w:rFonts w:ascii="Georgia" w:hAnsi="Georgia" w:eastAsia="楷体" w:cs="Georgia" w:hint="eastAsia"/>
+      <w:spacing w:after="160" w:before="80" w:line="340" w:lineRule="auto"/>
+      <w:ind w:firstLine="0" w:left="720" w:right="480"/>
+    </w:pPr>
+    <w:rPr>
+      <w:rFonts w:ascii="Garamond" w:hAnsi="Garamond" w:eastAsia="楷体" w:cs="Garamond" w:hint="eastAsia"/>
       <w:sz w:val="23"/>
       <w:szCs w:val="23"/>
-      <w:color w:val="5A5A5A"/>
-      <w:i/>
+      <w:color w:val="475569"/>
     </w:rPr>
   </w:style>
   <w:style w:styleId="FootnoteText" w:type="paragraph">
@@ -1059,12 +1059,12 @@
       </w:tcPr>
     </w:tblStylePr>
     <w:pPr>
-      <w:spacing w:after="0" w:line="260" w:lineRule="auto"/>
+      <w:spacing w:after="0" w:line="268" w:lineRule="auto"/>
     </w:pPr>
     <w:rPr>
       <w:rFonts w:ascii="Calibri" w:hAnsi="Calibri" w:eastAsia="宋体" w:cs="Calibri" w:hint="eastAsia"/>
-      <w:sz w:val="21"/>
-      <w:szCs w:val="21"/>
+      <w:sz w:val="22"/>
+      <w:szCs w:val="22"/>
     </w:rPr>
   </w:style>
   <w:style w:customStyle="1" w:styleId="DefinitionTerm" w:type="paragraph">
@@ -1089,14 +1089,14 @@
     <w:basedOn w:val="Normal"/>
     <w:link w:val="BodyTextChar"/>
     <w:pPr>
-      <w:spacing w:after="60" w:before="0" w:line="260" w:lineRule="auto"/>
-    </w:pPr>
-    <w:rPr>
-      <w:i/>
+      <w:spacing w:after="80" w:before="40" w:line="260" w:lineRule="auto"/>
+      <w:jc w:val="center"/>
+    </w:pPr>
+    <w:rPr>
       <w:rFonts w:ascii="Calibri" w:hAnsi="Calibri" w:eastAsia="等线" w:cs="Calibri" w:hint="eastAsia"/>
-      <w:sz w:val="20"/>
-      <w:szCs w:val="20"/>
-      <w:color w:val="6C7883"/>
+      <w:sz w:val="19"/>
+      <w:szCs w:val="19"/>
+      <w:color w:val="64748B"/>
     </w:rPr>
   </w:style>
   <w:style w:customStyle="1" w:styleId="TableCaption" w:type="paragraph">
@@ -1104,28 +1104,28 @@
     <w:basedOn w:val="Caption"/>
     <w:pPr>
       <w:keepNext/>
-      <w:spacing w:after="60" w:line="260" w:lineRule="auto"/>
+      <w:jc w:val="center"/>
+      <w:spacing w:before="40" w:after="80" w:line="260" w:lineRule="auto"/>
     </w:pPr>
     <w:rPr>
       <w:rFonts w:ascii="Calibri" w:hAnsi="Calibri" w:eastAsia="等线" w:cs="Calibri" w:hint="eastAsia"/>
-      <w:sz w:val="20"/>
-      <w:szCs w:val="20"/>
-      <w:color w:val="6C7883"/>
-      <w:i/>
+      <w:sz w:val="19"/>
+      <w:szCs w:val="19"/>
+      <w:color w:val="64748B"/>
     </w:rPr>
   </w:style>
   <w:style w:customStyle="1" w:styleId="ImageCaption" w:type="paragraph">
     <w:name w:val="Image Caption"/>
     <w:basedOn w:val="Caption"/>
     <w:pPr>
-      <w:spacing w:after="60" w:line="260" w:lineRule="auto"/>
+      <w:jc w:val="center"/>
+      <w:spacing w:before="40" w:after="80" w:line="260" w:lineRule="auto"/>
     </w:pPr>
     <w:rPr>
       <w:rFonts w:ascii="Calibri" w:hAnsi="Calibri" w:eastAsia="等线" w:cs="Calibri" w:hint="eastAsia"/>
-      <w:sz w:val="20"/>
-      <w:szCs w:val="20"/>
-      <w:color w:val="6C7883"/>
-      <w:i/>
+      <w:sz w:val="19"/>
+      <w:szCs w:val="19"/>
+      <w:color w:val="64748B"/>
     </w:rPr>
   </w:style>
   <w:style w:customStyle="1" w:styleId="Figure" w:type="paragraph">
@@ -1168,10 +1168,10 @@
     <w:name w:val="Hyperlink"/>
     <w:basedOn w:val="BodyTextChar"/>
     <w:rPr>
-      <w:color w:themeColor="accent1" w:val="1E5A96"/>
+      <w:color w:themeColor="accent1" w:val="2563EB"/>
       <w:rFonts w:ascii="Calibri" w:hAnsi="Calibri" w:eastAsia="等线" w:cs="Calibri" w:hint="eastAsia"/>
-      <w:sz w:val="22"/>
-      <w:szCs w:val="22"/>
+      <w:sz w:val="24"/>
+      <w:szCs w:val="24"/>
     </w:rPr>
     <w:pPr/>
   </w:style>
@@ -1183,16 +1183,16 @@
     <w:unhideWhenUsed/>
     <w:qFormat/>
     <w:pPr>
-      <w:spacing w:before="180" w:line="288" w:lineRule="auto" w:after="100"/>
+      <w:spacing w:before="200" w:line="288" w:lineRule="auto" w:after="120"/>
       <w:outlineLvl w:val="9"/>
     </w:pPr>
     <w:rPr>
       <w:rFonts w:asciiTheme="majorHAnsi" w:cstheme="majorBidi" w:eastAsiaTheme="majorEastAsia" w:hAnsiTheme="majorHAnsi" w:ascii="Calibri" w:hAnsi="Calibri" w:eastAsia="微软雅黑" w:cs="Calibri" w:hint="eastAsia"/>
       <w:b w:val="0"/>
       <w:bCs w:val="0"/>
-      <w:color w:themeColor="accent1" w:themeShade="BF" w:val="1F4E79"/>
-      <w:sz w:val="26"/>
-      <w:szCs w:val="26"/>
+      <w:color w:themeColor="accent1" w:themeShade="BF" w:val="1E3A5F"/>
+      <w:sz w:val="28"/>
+      <w:szCs w:val="28"/>
     </w:rPr>
   </w:style>
   <w:style w:type="paragraph" w:customStyle="1" w:styleId="SourceCode">
@@ -1201,14 +1201,14 @@
     <w:link w:val="VerbatimChar"/>
     <w:pPr>
       <w:wordWrap w:val="off"/>
-      <w:spacing w:before="80" w:after="140" w:line="260" w:lineRule="auto"/>
+      <w:spacing w:before="100" w:after="160" w:line="260" w:lineRule="auto"/>
     </w:pPr>
     <w:rPr>
       <w:rFonts w:ascii="Consolas" w:hAnsi="Consolas" w:eastAsia="等线" w:cs="Consolas" w:hint="eastAsia"/>
       <w:sz w:val="20"/>
       <w:szCs w:val="20"/>
-      <w:color w:val="2D3748"/>
-      <w:shd w:val="clear" w:fill="F3F5F7"/>
+      <w:color w:val="1E293B"/>
+      <w:shd w:val="clear" w:fill="F1F5F9"/>
     </w:rPr>
   </w:style>
   <w:style w:type="character" w:customStyle="1" w:styleId="KeywordTok">

</xml_diff>